<commit_message>
Fix R-04: read one album-art config file in every run mode
The GUI passed its own __file__ and the pipeline passed its own, so the
window read album_art_sync/album_art_config.json while batch runs read
album_art_sync/core/album_art_config.json -- an empty file on an install
whose keys were entered in the window, so the CLI silently lost Fanart.tv.

Both now call an argument-free load_config()/save_config() that resolves
album_art_sync/config/album_art_config.json. A legacy JSON is migrated
with its sibling .key (a JSON without its key cannot be decrypted) and the
re-hardening step, since copyfile carries content but not permissions.
</commit_message>
<xml_diff>
--- a/user_guides/individual_programs/album_art_sync/Album_Art_Synchronizer_User_Guide.docx
+++ b/user_guides/individual_programs/album_art_sync/Album_Art_Synchronizer_User_Guide.docx
@@ -467,7 +467,12 @@
     </w:p>
     <w:p>
       <w:r>
-        <w:t>Fanart.tv credentials are loaded from album_art_config.json next to the tool and are encrypted through the suite KeyManager. The configuration loader can create a default template when the file is missing. Do not place credentials in the guide, source code, or command line.</w:t>
+        <w:t>Fanart.tv credentials are loaded from one file, `album_art_sync/config/album_art_config.json`, and are encrypted through the suite KeyManager with the key stored beside it as `album_art_config.key`. The window and every command-line or batch run read that same file, so a key entered once in the window is used everywhere.</w:t>
+      </w:r>
+    </w:p>
+    <w:p>
+      <w:r>
+        <w:t>If the file is missing, the loader looks for a copy left by an earlier version in `album_art_sync/album_art_config.json` or `album_art_sync/core/album_art_config.json`. When it finds one it copies the file and its `.key` into the config folder and leaves the originals untouched, so you can still recover them by hand. If the file is missing entirely, a template with empty keys is created. Do not place credentials in the guide, source code, or command line.</w:t>
       </w:r>
     </w:p>
     <w:p>

</xml_diff>